<commit_message>
Fix- Entrega Final Prova Impacta
</commit_message>
<xml_diff>
--- a/ProvaFinal/Documentacao/Prova_Final.docx
+++ b/ProvaFinal/Documentacao/Prova_Final.docx
@@ -47,403 +47,425 @@
           <w:szCs w:val="24"/>
         </w:rPr>
       </w:pPr>
+    </w:p>
+    <w:p>
+      <w:pPr>
+        <w:jc w:val="center"/>
+        <w:rPr>
+          <w:rFonts w:ascii="Arial" w:hAnsi="Arial" w:cs="Arial"/>
+          <w:b/>
+          <w:bCs/>
+          <w:sz w:val="24"/>
+          <w:szCs w:val="24"/>
+        </w:rPr>
+      </w:pPr>
+    </w:p>
+    <w:p>
+      <w:pPr>
+        <w:jc w:val="center"/>
+        <w:rPr>
+          <w:rFonts w:ascii="Arial" w:hAnsi="Arial" w:cs="Arial"/>
+          <w:b/>
+          <w:bCs/>
+          <w:sz w:val="24"/>
+          <w:szCs w:val="24"/>
+        </w:rPr>
+      </w:pPr>
+    </w:p>
+    <w:p>
+      <w:pPr>
+        <w:jc w:val="center"/>
+        <w:rPr>
+          <w:rFonts w:ascii="Arial" w:hAnsi="Arial" w:cs="Arial"/>
+          <w:b/>
+          <w:bCs/>
+          <w:sz w:val="24"/>
+          <w:szCs w:val="24"/>
+        </w:rPr>
+      </w:pPr>
+    </w:p>
+    <w:p>
+      <w:pPr>
+        <w:jc w:val="center"/>
+        <w:rPr>
+          <w:rFonts w:ascii="Arial" w:hAnsi="Arial" w:cs="Arial"/>
+          <w:b/>
+          <w:bCs/>
+          <w:sz w:val="24"/>
+          <w:szCs w:val="24"/>
+        </w:rPr>
+      </w:pPr>
+    </w:p>
+    <w:p>
+      <w:pPr>
+        <w:jc w:val="center"/>
+        <w:rPr>
+          <w:rFonts w:ascii="Arial" w:hAnsi="Arial" w:cs="Arial"/>
+          <w:b/>
+          <w:bCs/>
+          <w:sz w:val="24"/>
+          <w:szCs w:val="24"/>
+        </w:rPr>
+      </w:pPr>
+    </w:p>
+    <w:p>
+      <w:pPr>
+        <w:jc w:val="center"/>
+        <w:rPr>
+          <w:rFonts w:ascii="Arial" w:hAnsi="Arial" w:cs="Arial"/>
+          <w:b/>
+          <w:bCs/>
+          <w:sz w:val="24"/>
+          <w:szCs w:val="24"/>
+        </w:rPr>
+      </w:pPr>
+      <w:r>
+        <w:rPr>
+          <w:rFonts w:ascii="Arial" w:hAnsi="Arial" w:cs="Arial"/>
+          <w:b/>
+          <w:bCs/>
+          <w:sz w:val="24"/>
+          <w:szCs w:val="24"/>
+        </w:rPr>
+        <w:t>RENATO DE SOUSA SANCHES</w:t>
+      </w:r>
+    </w:p>
+    <w:p>
+      <w:pPr>
+        <w:jc w:val="center"/>
+        <w:rPr>
+          <w:rFonts w:ascii="Arial" w:hAnsi="Arial" w:cs="Arial"/>
+          <w:b/>
+          <w:bCs/>
+          <w:sz w:val="24"/>
+          <w:szCs w:val="24"/>
+        </w:rPr>
+      </w:pPr>
+      <w:r>
+        <w:rPr>
+          <w:rFonts w:ascii="Arial" w:hAnsi="Arial" w:cs="Arial"/>
+          <w:b/>
+          <w:bCs/>
+          <w:sz w:val="24"/>
+          <w:szCs w:val="24"/>
+        </w:rPr>
+        <w:t>PEDRO HENRIQUE MENDONÇA AMORIM</w:t>
+      </w:r>
+    </w:p>
+    <w:p>
+      <w:pPr>
+        <w:jc w:val="center"/>
+        <w:rPr>
+          <w:rFonts w:ascii="Arial" w:hAnsi="Arial" w:cs="Arial"/>
+          <w:b/>
+          <w:bCs/>
+          <w:sz w:val="24"/>
+          <w:szCs w:val="24"/>
+        </w:rPr>
+      </w:pPr>
+      <w:r>
+        <w:rPr>
+          <w:rFonts w:ascii="Arial" w:hAnsi="Arial" w:cs="Arial"/>
+          <w:b/>
+          <w:bCs/>
+          <w:sz w:val="24"/>
+          <w:szCs w:val="24"/>
+        </w:rPr>
+        <w:t>ANDERSON DE OLIVEIRA DE SOUZA</w:t>
+      </w:r>
+    </w:p>
+    <w:p>
+      <w:pPr>
+        <w:jc w:val="center"/>
+        <w:rPr>
+          <w:rFonts w:ascii="Arial" w:hAnsi="Arial" w:cs="Arial"/>
+          <w:b/>
+          <w:bCs/>
+          <w:sz w:val="24"/>
+          <w:szCs w:val="24"/>
+        </w:rPr>
+      </w:pPr>
+    </w:p>
+    <w:p>
+      <w:pPr>
+        <w:rPr>
+          <w:rFonts w:ascii="Arial" w:hAnsi="Arial" w:cs="Arial"/>
+          <w:b/>
+          <w:bCs/>
+          <w:sz w:val="24"/>
+          <w:szCs w:val="24"/>
+        </w:rPr>
+      </w:pPr>
+    </w:p>
+    <w:p>
+      <w:pPr>
+        <w:jc w:val="center"/>
+        <w:rPr>
+          <w:rFonts w:ascii="Arial" w:hAnsi="Arial" w:cs="Arial"/>
+          <w:b/>
+          <w:bCs/>
+          <w:sz w:val="24"/>
+          <w:szCs w:val="24"/>
+        </w:rPr>
+      </w:pPr>
+    </w:p>
+    <w:p>
+      <w:pPr>
+        <w:rPr>
+          <w:rFonts w:ascii="Arial" w:hAnsi="Arial" w:cs="Arial"/>
+          <w:b/>
+          <w:bCs/>
+          <w:sz w:val="24"/>
+          <w:szCs w:val="24"/>
+        </w:rPr>
+      </w:pPr>
+    </w:p>
+    <w:p>
+      <w:pPr>
+        <w:jc w:val="center"/>
+        <w:rPr>
+          <w:rFonts w:ascii="Arial" w:hAnsi="Arial" w:cs="Arial"/>
+          <w:b/>
+          <w:bCs/>
+          <w:sz w:val="24"/>
+          <w:szCs w:val="24"/>
+        </w:rPr>
+      </w:pPr>
+    </w:p>
+    <w:p>
+      <w:pPr>
+        <w:jc w:val="center"/>
+        <w:rPr>
+          <w:rFonts w:ascii="Arial" w:hAnsi="Arial" w:cs="Arial"/>
+          <w:b/>
+          <w:bCs/>
+          <w:sz w:val="24"/>
+          <w:szCs w:val="24"/>
+        </w:rPr>
+      </w:pPr>
+    </w:p>
+    <w:p>
+      <w:pPr>
+        <w:jc w:val="center"/>
+        <w:rPr>
+          <w:rFonts w:ascii="Arial Black" w:hAnsi="Arial Black"/>
+          <w:sz w:val="24"/>
+          <w:szCs w:val="24"/>
+        </w:rPr>
+      </w:pPr>
+      <w:r>
+        <w:rPr>
+          <w:rFonts w:hint="default" w:ascii="Arial Black" w:hAnsi="Arial Black"/>
+          <w:sz w:val="24"/>
+          <w:szCs w:val="24"/>
+        </w:rPr>
+        <w:t>Análise Demográfica, Mortalidade e Hábitos de Vida no Brasil (Power BI)</w:t>
+      </w:r>
+    </w:p>
+    <w:p>
+      <w:pPr>
+        <w:jc w:val="center"/>
+        <w:rPr>
+          <w:rFonts w:ascii="Arial" w:hAnsi="Arial" w:cs="Arial"/>
+          <w:b/>
+          <w:bCs/>
+          <w:sz w:val="24"/>
+          <w:szCs w:val="24"/>
+        </w:rPr>
+      </w:pPr>
+    </w:p>
+    <w:p>
+      <w:pPr>
+        <w:jc w:val="center"/>
+        <w:rPr>
+          <w:rFonts w:ascii="Arial" w:hAnsi="Arial" w:cs="Arial"/>
+          <w:b/>
+          <w:bCs/>
+          <w:sz w:val="24"/>
+          <w:szCs w:val="24"/>
+        </w:rPr>
+      </w:pPr>
+    </w:p>
+    <w:p>
+      <w:pPr>
+        <w:jc w:val="center"/>
+        <w:rPr>
+          <w:rFonts w:ascii="Arial" w:hAnsi="Arial" w:cs="Arial"/>
+          <w:b/>
+          <w:bCs/>
+          <w:sz w:val="24"/>
+          <w:szCs w:val="24"/>
+        </w:rPr>
+      </w:pPr>
+    </w:p>
+    <w:p>
+      <w:pPr>
+        <w:jc w:val="center"/>
+        <w:rPr>
+          <w:rFonts w:ascii="Arial" w:hAnsi="Arial" w:cs="Arial"/>
+          <w:b/>
+          <w:bCs/>
+          <w:sz w:val="24"/>
+          <w:szCs w:val="24"/>
+        </w:rPr>
+      </w:pPr>
+    </w:p>
+    <w:p>
+      <w:pPr>
+        <w:jc w:val="center"/>
+        <w:rPr>
+          <w:rFonts w:ascii="Arial" w:hAnsi="Arial" w:cs="Arial"/>
+          <w:b/>
+          <w:bCs/>
+          <w:sz w:val="24"/>
+          <w:szCs w:val="24"/>
+        </w:rPr>
+      </w:pPr>
+    </w:p>
+    <w:p>
+      <w:pPr>
+        <w:jc w:val="center"/>
+        <w:rPr>
+          <w:rFonts w:ascii="Arial" w:hAnsi="Arial" w:cs="Arial"/>
+          <w:b/>
+          <w:bCs/>
+          <w:sz w:val="24"/>
+          <w:szCs w:val="24"/>
+        </w:rPr>
+      </w:pPr>
+    </w:p>
+    <w:p>
+      <w:pPr>
+        <w:jc w:val="center"/>
+        <w:rPr>
+          <w:rFonts w:ascii="Arial" w:hAnsi="Arial" w:cs="Arial"/>
+          <w:b/>
+          <w:bCs/>
+          <w:sz w:val="24"/>
+          <w:szCs w:val="24"/>
+        </w:rPr>
+      </w:pPr>
+    </w:p>
+    <w:p>
+      <w:pPr>
+        <w:jc w:val="center"/>
+        <w:rPr>
+          <w:rFonts w:ascii="Arial" w:hAnsi="Arial" w:cs="Arial"/>
+          <w:b/>
+          <w:bCs/>
+          <w:sz w:val="24"/>
+          <w:szCs w:val="24"/>
+        </w:rPr>
+      </w:pPr>
+    </w:p>
+    <w:p>
+      <w:pPr>
+        <w:jc w:val="center"/>
+        <w:rPr>
+          <w:rFonts w:ascii="Arial" w:hAnsi="Arial" w:cs="Arial"/>
+          <w:b/>
+          <w:bCs/>
+          <w:sz w:val="24"/>
+          <w:szCs w:val="24"/>
+        </w:rPr>
+      </w:pPr>
+    </w:p>
+    <w:p>
+      <w:pPr>
+        <w:jc w:val="center"/>
+        <w:rPr>
+          <w:rFonts w:ascii="Arial" w:hAnsi="Arial" w:cs="Arial"/>
+          <w:b/>
+          <w:bCs/>
+          <w:sz w:val="24"/>
+          <w:szCs w:val="24"/>
+        </w:rPr>
+      </w:pPr>
+    </w:p>
+    <w:p>
+      <w:pPr>
+        <w:jc w:val="center"/>
+        <w:rPr>
+          <w:rFonts w:ascii="Arial" w:hAnsi="Arial" w:cs="Arial"/>
+          <w:b/>
+          <w:bCs/>
+          <w:sz w:val="24"/>
+          <w:szCs w:val="24"/>
+        </w:rPr>
+      </w:pPr>
+      <w:r>
+        <w:rPr>
+          <w:rFonts w:ascii="Arial" w:hAnsi="Arial" w:cs="Arial"/>
+          <w:b/>
+          <w:bCs/>
+          <w:sz w:val="24"/>
+          <w:szCs w:val="24"/>
+        </w:rPr>
+        <w:t>São Paulo – SP</w:t>
+      </w:r>
+    </w:p>
+    <w:p>
+      <w:pPr>
+        <w:jc w:val="center"/>
+        <w:rPr>
+          <w:rFonts w:ascii="Arial" w:hAnsi="Arial" w:cs="Arial"/>
+          <w:b/>
+          <w:bCs/>
+          <w:sz w:val="24"/>
+          <w:szCs w:val="24"/>
+        </w:rPr>
+      </w:pPr>
+      <w:r>
+        <w:rPr>
+          <w:rFonts w:ascii="Arial" w:hAnsi="Arial" w:cs="Arial"/>
+          <w:b/>
+          <w:bCs/>
+          <w:sz w:val="24"/>
+          <w:szCs w:val="24"/>
+        </w:rPr>
+        <w:t>2026</w:t>
+      </w:r>
+    </w:p>
+    <w:p>
+      <w:pPr>
+        <w:jc w:val="center"/>
+        <w:rPr>
+          <w:rFonts w:hint="default" w:ascii="Arial Black" w:hAnsi="Arial Black"/>
+          <w:sz w:val="24"/>
+          <w:szCs w:val="24"/>
+        </w:rPr>
+      </w:pPr>
+      <w:r>
+        <w:rPr>
+          <w:rFonts w:hint="default" w:ascii="Arial Black" w:hAnsi="Arial Black"/>
+          <w:sz w:val="24"/>
+          <w:szCs w:val="24"/>
+        </w:rPr>
+        <w:t>Análise Demográfica, Mortalidade e Hábitos de Vida no Brasil (Power BI)</w:t>
+      </w:r>
+    </w:p>
+    <w:p>
+      <w:pPr>
+        <w:pStyle w:val="16"/>
+        <w:keepNext w:val="0"/>
+        <w:keepLines w:val="0"/>
+        <w:widowControl/>
+        <w:suppressLineNumbers w:val="0"/>
+        <w:spacing w:beforeAutospacing="1"/>
+        <w:ind w:firstLine="708" w:firstLineChars="0"/>
+        <w:rPr>
+          <w:rFonts w:hint="default" w:ascii="Arial Black" w:hAnsi="Arial Black"/>
+          <w:sz w:val="24"/>
+          <w:szCs w:val="24"/>
+        </w:rPr>
+      </w:pPr>
+      <w:r>
+        <w:t>Como o dashboard realiza correlações entre população, óbitos, atividade física e consumo de alimentos ultraprocessados por Unidade da Federação, o modelo foi estruturado tendo a entidade Estado como dimensão principal. A partir dela relacionam-se as tabelas de fatos População, Óbitos, Atividade Física e Consumo de Alimentos Ultraprocessados, permitindo análises comparativas entre indicadores de</w:t>
+      </w:r>
       <w:bookmarkStart w:id="1" w:name="_GoBack"/>
       <w:bookmarkEnd w:id="1"/>
-    </w:p>
-    <w:p>
-      <w:pPr>
-        <w:jc w:val="center"/>
-        <w:rPr>
-          <w:rFonts w:ascii="Arial" w:hAnsi="Arial" w:cs="Arial"/>
-          <w:b/>
-          <w:bCs/>
-          <w:sz w:val="24"/>
-          <w:szCs w:val="24"/>
-        </w:rPr>
-      </w:pPr>
-    </w:p>
-    <w:p>
-      <w:pPr>
-        <w:jc w:val="center"/>
-        <w:rPr>
-          <w:rFonts w:ascii="Arial" w:hAnsi="Arial" w:cs="Arial"/>
-          <w:b/>
-          <w:bCs/>
-          <w:sz w:val="24"/>
-          <w:szCs w:val="24"/>
-        </w:rPr>
-      </w:pPr>
-    </w:p>
-    <w:p>
-      <w:pPr>
-        <w:jc w:val="center"/>
-        <w:rPr>
-          <w:rFonts w:ascii="Arial" w:hAnsi="Arial" w:cs="Arial"/>
-          <w:b/>
-          <w:bCs/>
-          <w:sz w:val="24"/>
-          <w:szCs w:val="24"/>
-        </w:rPr>
-      </w:pPr>
-    </w:p>
-    <w:p>
-      <w:pPr>
-        <w:jc w:val="center"/>
-        <w:rPr>
-          <w:rFonts w:ascii="Arial" w:hAnsi="Arial" w:cs="Arial"/>
-          <w:b/>
-          <w:bCs/>
-          <w:sz w:val="24"/>
-          <w:szCs w:val="24"/>
-        </w:rPr>
-      </w:pPr>
-    </w:p>
-    <w:p>
-      <w:pPr>
-        <w:jc w:val="center"/>
-        <w:rPr>
-          <w:rFonts w:ascii="Arial" w:hAnsi="Arial" w:cs="Arial"/>
-          <w:b/>
-          <w:bCs/>
-          <w:sz w:val="24"/>
-          <w:szCs w:val="24"/>
-        </w:rPr>
-      </w:pPr>
-    </w:p>
-    <w:p>
-      <w:pPr>
-        <w:jc w:val="center"/>
-        <w:rPr>
-          <w:rFonts w:ascii="Arial" w:hAnsi="Arial" w:cs="Arial"/>
-          <w:b/>
-          <w:bCs/>
-          <w:sz w:val="24"/>
-          <w:szCs w:val="24"/>
-        </w:rPr>
-      </w:pPr>
-      <w:r>
-        <w:rPr>
-          <w:rFonts w:ascii="Arial" w:hAnsi="Arial" w:cs="Arial"/>
-          <w:b/>
-          <w:bCs/>
-          <w:sz w:val="24"/>
-          <w:szCs w:val="24"/>
-        </w:rPr>
-        <w:t>RENATO DE SOUSA SANCHES</w:t>
-      </w:r>
-    </w:p>
-    <w:p>
-      <w:pPr>
-        <w:jc w:val="center"/>
-        <w:rPr>
-          <w:rFonts w:ascii="Arial" w:hAnsi="Arial" w:cs="Arial"/>
-          <w:b/>
-          <w:bCs/>
-          <w:sz w:val="24"/>
-          <w:szCs w:val="24"/>
-        </w:rPr>
-      </w:pPr>
-      <w:r>
-        <w:rPr>
-          <w:rFonts w:ascii="Arial" w:hAnsi="Arial" w:cs="Arial"/>
-          <w:b/>
-          <w:bCs/>
-          <w:sz w:val="24"/>
-          <w:szCs w:val="24"/>
-        </w:rPr>
-        <w:t>PEDRO HENRIQUE MENDONÇA AMORIM</w:t>
-      </w:r>
-    </w:p>
-    <w:p>
-      <w:pPr>
-        <w:jc w:val="center"/>
-        <w:rPr>
-          <w:rFonts w:ascii="Arial" w:hAnsi="Arial" w:cs="Arial"/>
-          <w:b/>
-          <w:bCs/>
-          <w:sz w:val="24"/>
-          <w:szCs w:val="24"/>
-        </w:rPr>
-      </w:pPr>
-      <w:r>
-        <w:rPr>
-          <w:rFonts w:ascii="Arial" w:hAnsi="Arial" w:cs="Arial"/>
-          <w:b/>
-          <w:bCs/>
-          <w:sz w:val="24"/>
-          <w:szCs w:val="24"/>
-        </w:rPr>
-        <w:t>ANDERSON DE OLIVEIRA DE SOUZA</w:t>
-      </w:r>
-    </w:p>
-    <w:p>
-      <w:pPr>
-        <w:jc w:val="center"/>
-        <w:rPr>
-          <w:rFonts w:ascii="Arial" w:hAnsi="Arial" w:cs="Arial"/>
-          <w:b/>
-          <w:bCs/>
-          <w:sz w:val="24"/>
-          <w:szCs w:val="24"/>
-        </w:rPr>
-      </w:pPr>
-    </w:p>
-    <w:p>
-      <w:pPr>
-        <w:rPr>
-          <w:rFonts w:ascii="Arial" w:hAnsi="Arial" w:cs="Arial"/>
-          <w:b/>
-          <w:bCs/>
-          <w:sz w:val="24"/>
-          <w:szCs w:val="24"/>
-        </w:rPr>
-      </w:pPr>
-    </w:p>
-    <w:p>
-      <w:pPr>
-        <w:jc w:val="center"/>
-        <w:rPr>
-          <w:rFonts w:ascii="Arial" w:hAnsi="Arial" w:cs="Arial"/>
-          <w:b/>
-          <w:bCs/>
-          <w:sz w:val="24"/>
-          <w:szCs w:val="24"/>
-        </w:rPr>
-      </w:pPr>
-    </w:p>
-    <w:p>
-      <w:pPr>
-        <w:rPr>
-          <w:rFonts w:ascii="Arial" w:hAnsi="Arial" w:cs="Arial"/>
-          <w:b/>
-          <w:bCs/>
-          <w:sz w:val="24"/>
-          <w:szCs w:val="24"/>
-        </w:rPr>
-      </w:pPr>
-    </w:p>
-    <w:p>
-      <w:pPr>
-        <w:jc w:val="center"/>
-        <w:rPr>
-          <w:rFonts w:ascii="Arial" w:hAnsi="Arial" w:cs="Arial"/>
-          <w:b/>
-          <w:bCs/>
-          <w:sz w:val="24"/>
-          <w:szCs w:val="24"/>
-        </w:rPr>
-      </w:pPr>
-    </w:p>
-    <w:p>
-      <w:pPr>
-        <w:jc w:val="center"/>
-        <w:rPr>
-          <w:rFonts w:ascii="Arial" w:hAnsi="Arial" w:cs="Arial"/>
-          <w:b/>
-          <w:bCs/>
-          <w:sz w:val="24"/>
-          <w:szCs w:val="24"/>
-        </w:rPr>
-      </w:pPr>
-    </w:p>
-    <w:p>
-      <w:pPr>
-        <w:jc w:val="center"/>
-        <w:rPr>
-          <w:rFonts w:ascii="Arial Black" w:hAnsi="Arial Black"/>
-          <w:sz w:val="24"/>
-          <w:szCs w:val="24"/>
-        </w:rPr>
-      </w:pPr>
-      <w:r>
-        <w:rPr>
-          <w:rFonts w:hint="default" w:ascii="Arial Black" w:hAnsi="Arial Black"/>
-          <w:sz w:val="24"/>
-          <w:szCs w:val="24"/>
-        </w:rPr>
-        <w:t>Análise Demográfica, Mortalidade e Hábitos de Vida no Brasil (Power BI)</w:t>
-      </w:r>
-    </w:p>
-    <w:p>
-      <w:pPr>
-        <w:jc w:val="center"/>
-        <w:rPr>
-          <w:rFonts w:ascii="Arial" w:hAnsi="Arial" w:cs="Arial"/>
-          <w:b/>
-          <w:bCs/>
-          <w:sz w:val="24"/>
-          <w:szCs w:val="24"/>
-        </w:rPr>
-      </w:pPr>
-    </w:p>
-    <w:p>
-      <w:pPr>
-        <w:jc w:val="center"/>
-        <w:rPr>
-          <w:rFonts w:ascii="Arial" w:hAnsi="Arial" w:cs="Arial"/>
-          <w:b/>
-          <w:bCs/>
-          <w:sz w:val="24"/>
-          <w:szCs w:val="24"/>
-        </w:rPr>
-      </w:pPr>
-    </w:p>
-    <w:p>
-      <w:pPr>
-        <w:jc w:val="center"/>
-        <w:rPr>
-          <w:rFonts w:ascii="Arial" w:hAnsi="Arial" w:cs="Arial"/>
-          <w:b/>
-          <w:bCs/>
-          <w:sz w:val="24"/>
-          <w:szCs w:val="24"/>
-        </w:rPr>
-      </w:pPr>
-    </w:p>
-    <w:p>
-      <w:pPr>
-        <w:jc w:val="center"/>
-        <w:rPr>
-          <w:rFonts w:ascii="Arial" w:hAnsi="Arial" w:cs="Arial"/>
-          <w:b/>
-          <w:bCs/>
-          <w:sz w:val="24"/>
-          <w:szCs w:val="24"/>
-        </w:rPr>
-      </w:pPr>
-    </w:p>
-    <w:p>
-      <w:pPr>
-        <w:jc w:val="center"/>
-        <w:rPr>
-          <w:rFonts w:ascii="Arial" w:hAnsi="Arial" w:cs="Arial"/>
-          <w:b/>
-          <w:bCs/>
-          <w:sz w:val="24"/>
-          <w:szCs w:val="24"/>
-        </w:rPr>
-      </w:pPr>
-    </w:p>
-    <w:p>
-      <w:pPr>
-        <w:jc w:val="center"/>
-        <w:rPr>
-          <w:rFonts w:ascii="Arial" w:hAnsi="Arial" w:cs="Arial"/>
-          <w:b/>
-          <w:bCs/>
-          <w:sz w:val="24"/>
-          <w:szCs w:val="24"/>
-        </w:rPr>
-      </w:pPr>
-    </w:p>
-    <w:p>
-      <w:pPr>
-        <w:jc w:val="center"/>
-        <w:rPr>
-          <w:rFonts w:ascii="Arial" w:hAnsi="Arial" w:cs="Arial"/>
-          <w:b/>
-          <w:bCs/>
-          <w:sz w:val="24"/>
-          <w:szCs w:val="24"/>
-        </w:rPr>
-      </w:pPr>
-    </w:p>
-    <w:p>
-      <w:pPr>
-        <w:jc w:val="center"/>
-        <w:rPr>
-          <w:rFonts w:ascii="Arial" w:hAnsi="Arial" w:cs="Arial"/>
-          <w:b/>
-          <w:bCs/>
-          <w:sz w:val="24"/>
-          <w:szCs w:val="24"/>
-        </w:rPr>
-      </w:pPr>
-    </w:p>
-    <w:p>
-      <w:pPr>
-        <w:jc w:val="center"/>
-        <w:rPr>
-          <w:rFonts w:ascii="Arial" w:hAnsi="Arial" w:cs="Arial"/>
-          <w:b/>
-          <w:bCs/>
-          <w:sz w:val="24"/>
-          <w:szCs w:val="24"/>
-        </w:rPr>
-      </w:pPr>
-    </w:p>
-    <w:p>
-      <w:pPr>
-        <w:jc w:val="center"/>
-        <w:rPr>
-          <w:rFonts w:ascii="Arial" w:hAnsi="Arial" w:cs="Arial"/>
-          <w:b/>
-          <w:bCs/>
-          <w:sz w:val="24"/>
-          <w:szCs w:val="24"/>
-        </w:rPr>
-      </w:pPr>
-    </w:p>
-    <w:p>
-      <w:pPr>
-        <w:jc w:val="center"/>
-        <w:rPr>
-          <w:rFonts w:ascii="Arial" w:hAnsi="Arial" w:cs="Arial"/>
-          <w:b/>
-          <w:bCs/>
-          <w:sz w:val="24"/>
-          <w:szCs w:val="24"/>
-        </w:rPr>
-      </w:pPr>
-      <w:r>
-        <w:rPr>
-          <w:rFonts w:ascii="Arial" w:hAnsi="Arial" w:cs="Arial"/>
-          <w:b/>
-          <w:bCs/>
-          <w:sz w:val="24"/>
-          <w:szCs w:val="24"/>
-        </w:rPr>
-        <w:t>São Paulo – SP</w:t>
-      </w:r>
-    </w:p>
-    <w:p>
-      <w:pPr>
-        <w:jc w:val="center"/>
-        <w:rPr>
-          <w:rFonts w:ascii="Arial" w:hAnsi="Arial" w:cs="Arial"/>
-          <w:b/>
-          <w:bCs/>
-          <w:sz w:val="24"/>
-          <w:szCs w:val="24"/>
-        </w:rPr>
-      </w:pPr>
-      <w:r>
-        <w:rPr>
-          <w:rFonts w:ascii="Arial" w:hAnsi="Arial" w:cs="Arial"/>
-          <w:b/>
-          <w:bCs/>
-          <w:sz w:val="24"/>
-          <w:szCs w:val="24"/>
-        </w:rPr>
-        <w:t>2026</w:t>
-      </w:r>
-    </w:p>
-    <w:p>
-      <w:pPr>
-        <w:jc w:val="center"/>
-        <w:rPr>
-          <w:rFonts w:ascii="Arial Black" w:hAnsi="Arial Black"/>
-          <w:sz w:val="24"/>
-          <w:szCs w:val="24"/>
-        </w:rPr>
-      </w:pPr>
-      <w:r>
-        <w:rPr>
-          <w:rFonts w:hint="default" w:ascii="Arial Black" w:hAnsi="Arial Black"/>
-          <w:sz w:val="24"/>
-          <w:szCs w:val="24"/>
-        </w:rPr>
-        <w:t>Análise Demográfica, Mortalidade e Hábitos de Vida no Brasil (Power BI)</w:t>
+      <w:r>
+        <w:t>mográficos e hábitos de vida da população brasileira.</w:t>
       </w:r>
     </w:p>
     <w:p>

</xml_diff>